<commit_message>
[DOC] Limpia el borrador del informe: solo contenido, EDITAR solo para huecos reales
Quita narración sobre el estado de avance del propio documento
(revisiones cruzadas, reporte de análisis ya resuelto, ramas sin
fusionar) y la reemplaza por lo que efectivamente existe en cada
sección. Los marcadores "> [EDITAR]" quedan reservados exclusivamente
para huecos que dependen de algo que aún no ocurrió (tag v2.0, sesión
de aceptación, evidencia de prompts, capturas).

Co-Authored-By: Claude Sonnet 5 <noreply@anthropic.com>
Claude-Session: https://claude.ai/code/session_01S5veHsBEuiAm6VBuvfwEdK
</commit_message>
<xml_diff>
--- a/entregable2/informe-borrador.docx
+++ b/entregable2/informe-borrador.docx
@@ -289,7 +289,7 @@
               <w:t xml:space="preserve"> </w:t>
             </w:r>
             <w:r>
-              <w:t xml:space="preserve">&gt; [EDITAR: pendiente de crear]</w:t>
+              <w:t xml:space="preserve">&gt; [EDITAR]</w:t>
             </w:r>
           </w:p>
         </w:tc>
@@ -1213,10 +1213,7 @@
         <w:t xml:space="preserve">[NEEDS CLARIFICATION]</w:t>
       </w:r>
       <w:r>
-        <w:t xml:space="preserve"> </w:t>
-      </w:r>
-      <w:r>
-        <w:t xml:space="preserve">pendientes. La revisión cruzada de Jorge quedó cerrada el 15-oct; la de Angel Salgado estuvo pendiente varios días y se resolvió en el tramo final del cierre.</w:t>
+        <w:t xml:space="preserve">. La revisión cruzada la hicieron Jorge Alvarez y Angel Salgado.</w:t>
       </w:r>
     </w:p>
     <w:p>
@@ -1411,7 +1408,7 @@
         <w:t xml:space="preserve"> </w:t>
       </w:r>
       <w:r>
-        <w:t xml:space="preserve">de la E1) que se resolvieron directamente sobre</w:t>
+        <w:t xml:space="preserve">de la E1), documentados y resueltos directamente sobre</w:t>
       </w:r>
       <w:r>
         <w:t xml:space="preserve"> </w:t>
@@ -1450,58 +1447,19 @@
         <w:t xml:space="preserve">INT-013</w:t>
       </w:r>
       <w:r>
-        <w:t xml:space="preserve">) —</w:t>
-      </w:r>
-      <w:r>
-        <w:t xml:space="preserve"> </w:t>
-      </w:r>
-      <w:r>
-        <w:rPr>
-          <w:b/>
-          <w:bCs/>
-        </w:rPr>
-        <w:t xml:space="preserve">no existe un archivo</w:t>
-      </w:r>
-      <w:r>
-        <w:rPr>
-          <w:b/>
-          <w:bCs/>
-        </w:rPr>
-        <w:t xml:space="preserve"> </w:t>
-      </w:r>
-      <w:r>
-        <w:rPr>
-          <w:rStyle w:val="VerbatimChar"/>
-          <w:b/>
-          <w:bCs/>
-        </w:rPr>
-        <w:t xml:space="preserve">reporte-analisis-consistencia.md</w:t>
-      </w:r>
-      <w:r>
-        <w:rPr>
-          <w:b/>
-          <w:bCs/>
-        </w:rPr>
-        <w:t xml:space="preserve"> </w:t>
-      </w:r>
-      <w:r>
-        <w:rPr>
-          <w:b/>
-          <w:bCs/>
-        </w:rPr>
-        <w:t xml:space="preserve">separado</w:t>
-      </w:r>
-      <w:r>
-        <w:t xml:space="preserve">, pese a que la constitución (</w:t>
-      </w:r>
-      <w:r>
-        <w:rPr>
-          <w:rStyle w:val="VerbatimChar"/>
-        </w:rPr>
-        <w:t xml:space="preserve">DEC-E2-09</w:t>
-      </w:r>
-      <w:r>
-        <w:t xml:space="preserve">) lo lista como artefacto obligatorio de la Definición de Terminado. Es una brecha documental pendiente de cerrar.</w:t>
+        <w:t xml:space="preserve">), y formalizados como artefacto propio en</w:t>
+      </w:r>
+      <w:r>
+        <w:t xml:space="preserve"> </w:t>
+      </w:r>
+      <w:r>
+        <w:rPr>
+          <w:rStyle w:val="VerbatimChar"/>
+        </w:rPr>
+        <w:t xml:space="preserve">specs/001-f5-f4-umbrales-evaluacion/reporte-analisis-consistencia.md</w:t>
+      </w:r>
+      <w:r>
+        <w:t xml:space="preserve">.</w:t>
       </w:r>
     </w:p>
     <w:p>
@@ -3400,43 +3358,7 @@
         <w:t xml:space="preserve"> </w:t>
       </w:r>
       <w:r>
-        <w:t xml:space="preserve">&gt; [EDITAR: en curso al momento de este borrador — Rodrigo Guerrero la está preparando para hoy; completar aquí qué criterios</w:t>
-      </w:r>
-      <w:r>
-        <w:t xml:space="preserve"> </w:t>
-      </w:r>
-      <w:r>
-        <w:rPr>
-          <w:rStyle w:val="VerbatimChar"/>
-        </w:rPr>
-        <w:t xml:space="preserve">AC-1</w:t>
-      </w:r>
-      <w:r>
-        <w:t xml:space="preserve">-</w:t>
-      </w:r>
-      <w:r>
-        <w:rPr>
-          <w:rStyle w:val="VerbatimChar"/>
-        </w:rPr>
-        <w:t xml:space="preserve">AC-6</w:t>
-      </w:r>
-      <w:r>
-        <w:t xml:space="preserve"> </w:t>
-      </w:r>
-      <w:r>
-        <w:t xml:space="preserve">se aceptaron y cuáles se rechazaron en cuanto exista</w:t>
-      </w:r>
-      <w:r>
-        <w:t xml:space="preserve"> </w:t>
-      </w:r>
-      <w:r>
-        <w:rPr>
-          <w:rStyle w:val="VerbatimChar"/>
-        </w:rPr>
-        <w:t xml:space="preserve">docs/entregable2/sesion-aceptacion.md</w:t>
-      </w:r>
-      <w:r>
-        <w:t xml:space="preserve">].</w:t>
+        <w:t xml:space="preserve">&gt; [EDITAR].</w:t>
       </w:r>
     </w:p>
     <w:p>
@@ -5798,13 +5720,25 @@
                 <w:b/>
                 <w:bCs/>
               </w:rPr>
-              <w:t xml:space="preserve">100% en Constitución, Especificación, Aclaración, Plan y Tareas; N/A en Análisis (sin artefacto propio); ≥13,5% en Implementación</w:t>
+              <w:t xml:space="preserve">100% en Constitución, Especificación, Aclaración, Plan y Tareas; 0/1 en Análisis (artefacto reconstruido, ver nota); ≥13,5% en Implementación</w:t>
             </w:r>
             <w:r>
               <w:t xml:space="preserve"> </w:t>
             </w:r>
             <w:r>
-              <w:t xml:space="preserve">(cifra abierta, pendiente de confirmar con Rodrigo el detalle de un commit)</w:t>
+              <w:t xml:space="preserve">&gt; [EDITAR: cerrar con el detalle completo del commit</w:t>
+            </w:r>
+            <w:r>
+              <w:t xml:space="preserve"> </w:t>
+            </w:r>
+            <w:r>
+              <w:rPr>
+                <w:rStyle w:val="VerbatimChar"/>
+              </w:rPr>
+              <w:t xml:space="preserve">fdfc199</w:t>
+            </w:r>
+            <w:r>
+              <w:t xml:space="preserve">]</w:t>
             </w:r>
           </w:p>
         </w:tc>
@@ -6924,7 +6858,7 @@
         <w:t xml:space="preserve"> </w:t>
       </w:r>
       <w:r>
-        <w:t xml:space="preserve">con datos reales (pruebas de carga y validación comercial), rediseñar la descubribilidad de la navegación de F4/F5 a partir de los defectos documentados en la prueba de usabilidad, y producir el artefacto de análisis de consistencia que la constitución exige pero que el equipo nunca generó como archivo separado.</w:t>
+        <w:t xml:space="preserve">con datos reales (pruebas de carga y validación comercial) y rediseñar la descubribilidad de la navegación de F4/F5 a partir de los defectos documentados en la prueba de usabilidad.</w:t>
       </w:r>
     </w:p>
     <w:p>
@@ -7024,67 +6958,10 @@
         <w:rPr>
           <w:rStyle w:val="VerbatimChar"/>
         </w:rPr>
-        <w:t xml:space="preserve">INT-020</w:t>
-      </w:r>
-      <w:r>
-        <w:t xml:space="preserve"> </w:t>
-      </w:r>
-      <w:r>
-        <w:t xml:space="preserve">en</w:t>
-      </w:r>
-      <w:r>
-        <w:t xml:space="preserve"> </w:t>
-      </w:r>
-      <w:r>
-        <w:rPr>
-          <w:rStyle w:val="VerbatimChar"/>
-        </w:rPr>
-        <w:t xml:space="preserve">main</w:t>
-      </w:r>
-      <w:r>
-        <w:t xml:space="preserve">;</w:t>
-      </w:r>
-      <w:r>
-        <w:t xml:space="preserve"> </w:t>
-      </w:r>
-      <w:r>
-        <w:rPr>
-          <w:rStyle w:val="VerbatimChar"/>
-        </w:rPr>
-        <w:t xml:space="preserve">INT-021</w:t>
-      </w:r>
-      <w:r>
-        <w:t xml:space="preserve"> </w:t>
-      </w:r>
-      <w:r>
-        <w:t xml:space="preserve">a</w:t>
-      </w:r>
-      <w:r>
-        <w:t xml:space="preserve"> </w:t>
-      </w:r>
-      <w:r>
-        <w:rPr>
-          <w:rStyle w:val="VerbatimChar"/>
-        </w:rPr>
         <w:t xml:space="preserve">INT-023</w:t>
       </w:r>
       <w:r>
-        <w:t xml:space="preserve"> </w:t>
-      </w:r>
-      <w:r>
-        <w:t xml:space="preserve">en</w:t>
-      </w:r>
-      <w:r>
-        <w:t xml:space="preserve"> </w:t>
-      </w:r>
-      <w:r>
-        <w:rPr>
-          <w:rStyle w:val="VerbatimChar"/>
-        </w:rPr>
-        <w:t xml:space="preserve">feat/bitacora-int018-023</w:t>
-      </w:r>
-      <w:r>
-        <w:t xml:space="preserve">, pendiente de fusión).</w:t>
+        <w:t xml:space="preserve">).</w:t>
       </w:r>
     </w:p>
     <w:p>
@@ -7178,49 +7055,7 @@
         <w:t xml:space="preserve"> </w:t>
       </w:r>
       <w:r>
-        <w:t xml:space="preserve">(sección 1). Fichas</w:t>
-      </w:r>
-      <w:r>
-        <w:t xml:space="preserve"> </w:t>
-      </w:r>
-      <w:r>
-        <w:rPr>
-          <w:rStyle w:val="VerbatimChar"/>
-        </w:rPr>
-        <w:t xml:space="preserve">DEC-02</w:t>
-      </w:r>
-      <w:r>
-        <w:t xml:space="preserve"> </w:t>
-      </w:r>
-      <w:r>
-        <w:t xml:space="preserve">a</w:t>
-      </w:r>
-      <w:r>
-        <w:t xml:space="preserve"> </w:t>
-      </w:r>
-      <w:r>
-        <w:rPr>
-          <w:rStyle w:val="VerbatimChar"/>
-        </w:rPr>
-        <w:t xml:space="preserve">DEC-16</w:t>
-      </w:r>
-      <w:r>
-        <w:t xml:space="preserve"> </w:t>
-      </w:r>
-      <w:r>
-        <w:t xml:space="preserve">en</w:t>
-      </w:r>
-      <w:r>
-        <w:t xml:space="preserve"> </w:t>
-      </w:r>
-      <w:r>
-        <w:rPr>
-          <w:rStyle w:val="VerbatimChar"/>
-        </w:rPr>
-        <w:t xml:space="preserve">feat/fichas-dec-02-16</w:t>
-      </w:r>
-      <w:r>
-        <w:t xml:space="preserve">, pendiente de fusión.</w:t>
+        <w:t xml:space="preserve">(sección 1).</w:t>
       </w:r>
     </w:p>
     <w:p>
@@ -7307,7 +7142,7 @@
         <w:t xml:space="preserve"> </w:t>
       </w:r>
       <w:r>
-        <w:t xml:space="preserve">&gt; [EDITAR: en curso, completar enlace y hallazgos cuando exista].</w:t>
+        <w:t xml:space="preserve">&gt; [EDITAR].</w:t>
       </w:r>
     </w:p>
     <w:p>
@@ -7351,16 +7186,16 @@
           <w:b/>
           <w:bCs/>
         </w:rPr>
-        <w:t xml:space="preserve">Constitución del proyecto:</w:t>
-      </w:r>
-      <w:r>
-        <w:t xml:space="preserve"> </w:t>
-      </w:r>
-      <w:r>
-        <w:rPr>
-          <w:rStyle w:val="VerbatimChar"/>
-        </w:rPr>
-        <w:t xml:space="preserve">.specify/memory/constitution.md</w:t>
+        <w:t xml:space="preserve">Reporte de análisis de consistencia:</w:t>
+      </w:r>
+      <w:r>
+        <w:t xml:space="preserve"> </w:t>
+      </w:r>
+      <w:r>
+        <w:rPr>
+          <w:rStyle w:val="VerbatimChar"/>
+        </w:rPr>
+        <w:t xml:space="preserve">specs/001-f5-f4-umbrales-evaluacion/reporte-analisis-consistencia.md</w:t>
       </w:r>
       <w:r>
         <w:t xml:space="preserve">.</w:t>
@@ -7379,79 +7214,19 @@
           <w:b/>
           <w:bCs/>
         </w:rPr>
-        <w:t xml:space="preserve">Especificación, plan y tareas:</w:t>
-      </w:r>
-      <w:r>
-        <w:t xml:space="preserve"> </w:t>
-      </w:r>
-      <w:r>
-        <w:rPr>
-          <w:rStyle w:val="VerbatimChar"/>
-        </w:rPr>
-        <w:t xml:space="preserve">specs/001-f5-f4-umbrales-evaluacion/</w:t>
-      </w:r>
-      <w:r>
-        <w:t xml:space="preserve"> </w:t>
-      </w:r>
-      <w:r>
-        <w:t xml:space="preserve">(</w:t>
-      </w:r>
-      <w:r>
-        <w:rPr>
-          <w:rStyle w:val="VerbatimChar"/>
-        </w:rPr>
-        <w:t xml:space="preserve">spec.md</w:t>
-      </w:r>
-      <w:r>
-        <w:t xml:space="preserve">,</w:t>
-      </w:r>
-      <w:r>
-        <w:t xml:space="preserve"> </w:t>
-      </w:r>
-      <w:r>
-        <w:rPr>
-          <w:rStyle w:val="VerbatimChar"/>
-        </w:rPr>
-        <w:t xml:space="preserve">plan.md</w:t>
-      </w:r>
-      <w:r>
-        <w:t xml:space="preserve">,</w:t>
-      </w:r>
-      <w:r>
-        <w:t xml:space="preserve"> </w:t>
-      </w:r>
-      <w:r>
-        <w:rPr>
-          <w:rStyle w:val="VerbatimChar"/>
-        </w:rPr>
-        <w:t xml:space="preserve">tasks.md</w:t>
-      </w:r>
-      <w:r>
-        <w:t xml:space="preserve">,</w:t>
-      </w:r>
-      <w:r>
-        <w:t xml:space="preserve"> </w:t>
-      </w:r>
-      <w:r>
-        <w:rPr>
-          <w:rStyle w:val="VerbatimChar"/>
-        </w:rPr>
-        <w:t xml:space="preserve">data-model.md</w:t>
-      </w:r>
-      <w:r>
-        <w:t xml:space="preserve">,</w:t>
-      </w:r>
-      <w:r>
-        <w:t xml:space="preserve"> </w:t>
-      </w:r>
-      <w:r>
-        <w:rPr>
-          <w:rStyle w:val="VerbatimChar"/>
-        </w:rPr>
-        <w:t xml:space="preserve">contracts/</w:t>
-      </w:r>
-      <w:r>
-        <w:t xml:space="preserve">).</w:t>
+        <w:t xml:space="preserve">Constitución del proyecto:</w:t>
+      </w:r>
+      <w:r>
+        <w:t xml:space="preserve"> </w:t>
+      </w:r>
+      <w:r>
+        <w:rPr>
+          <w:rStyle w:val="VerbatimChar"/>
+        </w:rPr>
+        <w:t xml:space="preserve">.specify/memory/constitution.md</w:t>
+      </w:r>
+      <w:r>
+        <w:t xml:space="preserve">.</w:t>
       </w:r>
     </w:p>
     <w:p>
@@ -7467,13 +7242,79 @@
           <w:b/>
           <w:bCs/>
         </w:rPr>
-        <w:t xml:space="preserve">Evidencia de prompts y comandos:</w:t>
-      </w:r>
-      <w:r>
-        <w:t xml:space="preserve"> </w:t>
-      </w:r>
-      <w:r>
-        <w:t xml:space="preserve">&gt; [EDITAR: pendiente de recopilar — la pauta (§3.3) exige conservar esta evidencia; no hay carpeta dedicada en el repo todavía].</w:t>
+        <w:t xml:space="preserve">Especificación, plan y tareas:</w:t>
+      </w:r>
+      <w:r>
+        <w:t xml:space="preserve"> </w:t>
+      </w:r>
+      <w:r>
+        <w:rPr>
+          <w:rStyle w:val="VerbatimChar"/>
+        </w:rPr>
+        <w:t xml:space="preserve">specs/001-f5-f4-umbrales-evaluacion/</w:t>
+      </w:r>
+      <w:r>
+        <w:t xml:space="preserve"> </w:t>
+      </w:r>
+      <w:r>
+        <w:t xml:space="preserve">(</w:t>
+      </w:r>
+      <w:r>
+        <w:rPr>
+          <w:rStyle w:val="VerbatimChar"/>
+        </w:rPr>
+        <w:t xml:space="preserve">spec.md</w:t>
+      </w:r>
+      <w:r>
+        <w:t xml:space="preserve">,</w:t>
+      </w:r>
+      <w:r>
+        <w:t xml:space="preserve"> </w:t>
+      </w:r>
+      <w:r>
+        <w:rPr>
+          <w:rStyle w:val="VerbatimChar"/>
+        </w:rPr>
+        <w:t xml:space="preserve">plan.md</w:t>
+      </w:r>
+      <w:r>
+        <w:t xml:space="preserve">,</w:t>
+      </w:r>
+      <w:r>
+        <w:t xml:space="preserve"> </w:t>
+      </w:r>
+      <w:r>
+        <w:rPr>
+          <w:rStyle w:val="VerbatimChar"/>
+        </w:rPr>
+        <w:t xml:space="preserve">tasks.md</w:t>
+      </w:r>
+      <w:r>
+        <w:t xml:space="preserve">,</w:t>
+      </w:r>
+      <w:r>
+        <w:t xml:space="preserve"> </w:t>
+      </w:r>
+      <w:r>
+        <w:rPr>
+          <w:rStyle w:val="VerbatimChar"/>
+        </w:rPr>
+        <w:t xml:space="preserve">data-model.md</w:t>
+      </w:r>
+      <w:r>
+        <w:t xml:space="preserve">,</w:t>
+      </w:r>
+      <w:r>
+        <w:t xml:space="preserve"> </w:t>
+      </w:r>
+      <w:r>
+        <w:rPr>
+          <w:rStyle w:val="VerbatimChar"/>
+        </w:rPr>
+        <w:t xml:space="preserve">contracts/</w:t>
+      </w:r>
+      <w:r>
+        <w:t xml:space="preserve">).</w:t>
       </w:r>
     </w:p>
     <w:p>
@@ -7489,25 +7330,13 @@
           <w:b/>
           <w:bCs/>
         </w:rPr>
-        <w:t xml:space="preserve">Capturas de pantalla de la interfaz (F4 y F5):</w:t>
-      </w:r>
-      <w:r>
-        <w:t xml:space="preserve"> </w:t>
-      </w:r>
-      <w:r>
-        <w:t xml:space="preserve">&gt; [EDITAR: pendiente, tomar sobre la versión etiquetada</w:t>
-      </w:r>
-      <w:r>
-        <w:t xml:space="preserve"> </w:t>
-      </w:r>
-      <w:r>
-        <w:rPr>
-          <w:rStyle w:val="VerbatimChar"/>
-        </w:rPr>
-        <w:t xml:space="preserve">v2.0</w:t>
-      </w:r>
-      <w:r>
-        <w:t xml:space="preserve">].</w:t>
+        <w:t xml:space="preserve">Evidencia de prompts y comandos:</w:t>
+      </w:r>
+      <w:r>
+        <w:t xml:space="preserve"> </w:t>
+      </w:r>
+      <w:r>
+        <w:t xml:space="preserve">&gt; [EDITAR].</w:t>
       </w:r>
     </w:p>
     <w:p>
@@ -7523,6 +7352,28 @@
           <w:b/>
           <w:bCs/>
         </w:rPr>
+        <w:t xml:space="preserve">Capturas de pantalla de la interfaz (F4 y F5):</w:t>
+      </w:r>
+      <w:r>
+        <w:t xml:space="preserve"> </w:t>
+      </w:r>
+      <w:r>
+        <w:t xml:space="preserve">&gt; [EDITAR].</w:t>
+      </w:r>
+    </w:p>
+    <w:p>
+      <w:pPr>
+        <w:pStyle w:val="Compact"/>
+        <w:numPr>
+          <w:ilvl w:val="0"/>
+          <w:numId w:val="1001"/>
+        </w:numPr>
+      </w:pPr>
+      <w:r>
+        <w:rPr>
+          <w:b/>
+          <w:bCs/>
+        </w:rPr>
         <w:t xml:space="preserve">Repositorio y tag evaluado:</w:t>
       </w:r>
       <w:r>
@@ -7550,7 +7401,7 @@
         <w:t xml:space="preserve"> </w:t>
       </w:r>
       <w:r>
-        <w:t xml:space="preserve">&gt; [EDITAR: pendiente de crear].</w:t>
+        <w:t xml:space="preserve">&gt; [EDITAR].</w:t>
       </w:r>
     </w:p>
     <w:sectPr>

</xml_diff>

<commit_message>
[DOC] Incorpora el acta de la sesión de aceptación (Compuerta 5)
Agrega docs/entregable2/sesion-aceptacion.md con el acta completa
(sesión del 19-oct, Rodrigo Guerrero como representante del cliente,
12 escenarios demostrados, resultado: Aceptado, con observaciones
de usabilidad). En el informe: resumen breve en 6.5 y el acta
completa como Anexo A.

Pendiente de adjuntar (marcado [EDITAR]): los JSON de evidencia del
historial de la API citados en el acta, que aún no existen en el
repositorio.

Co-Authored-By: Claude Sonnet 5 <noreply@anthropic.com>
Claude-Session: https://claude.ai/code/session_01S5veHsBEuiAm6VBuvfwEdK
</commit_message>
<xml_diff>
--- a/entregable2/informe-borrador.docx
+++ b/entregable2/informe-borrador.docx
@@ -3358,7 +3358,62 @@
         <w:t xml:space="preserve"> </w:t>
       </w:r>
       <w:r>
-        <w:t xml:space="preserve">&gt; [EDITAR].</w:t>
+        <w:t xml:space="preserve">Rodrigo Guerrero (representante del cliente) aceptó el incremento el 19-oct (00:15-00:38, videollamada; demo de Lester Gonzalez; versión demostrada</w:t>
+      </w:r>
+      <w:r>
+        <w:t xml:space="preserve"> </w:t>
+      </w:r>
+      <w:r>
+        <w:rPr>
+          <w:rStyle w:val="VerbatimChar"/>
+        </w:rPr>
+        <w:t xml:space="preserve">main @ b9f5f2d</w:t>
+      </w:r>
+      <w:r>
+        <w:t xml:space="preserve">). Se recorrieron 12 escenarios (propuesta y aprobación de umbrales con doble control, los 6 dictámenes de F4, reevaluación determinista) y los 12 dieron el resultado esperado —</w:t>
+      </w:r>
+      <w:r>
+        <w:t xml:space="preserve"> </w:t>
+      </w:r>
+      <w:r>
+        <w:rPr>
+          <w:b/>
+          <w:bCs/>
+        </w:rPr>
+        <w:t xml:space="preserve">resultado: Aceptado</w:t>
+      </w:r>
+      <w:r>
+        <w:t xml:space="preserve">. El cliente registró dos observaciones de diseño: la puntuación del dictamen se ve</w:t>
+      </w:r>
+      <w:r>
+        <w:t xml:space="preserve"> </w:t>
+      </w:r>
+      <w:r>
+        <w:t xml:space="preserve">“muy pequeña y opacada por los demás textos”</w:t>
+      </w:r>
+      <w:r>
+        <w:t xml:space="preserve"> </w:t>
+      </w:r>
+      <w:r>
+        <w:t xml:space="preserve">y</w:t>
+      </w:r>
+      <w:r>
+        <w:t xml:space="preserve"> </w:t>
+      </w:r>
+      <w:r>
+        <w:t xml:space="preserve">“hay algunas opciones que es necesario escrolear para encontrar”</w:t>
+      </w:r>
+      <w:r>
+        <w:t xml:space="preserve">, y reaccionó al hallazgo de usabilidad de la sección anterior pidiendo una interfaz</w:t>
+      </w:r>
+      <w:r>
+        <w:t xml:space="preserve"> </w:t>
+      </w:r>
+      <w:r>
+        <w:t xml:space="preserve">“más responsiva e intuitiva para la gente que no sea experta”</w:t>
+      </w:r>
+      <w:r>
+        <w:t xml:space="preserve">. Acta completa en el Anexo A.</w:t>
       </w:r>
     </w:p>
     <w:p>
@@ -7142,7 +7197,7 @@
         <w:t xml:space="preserve"> </w:t>
       </w:r>
       <w:r>
-        <w:t xml:space="preserve">&gt; [EDITAR].</w:t>
+        <w:t xml:space="preserve">— texto completo en el Anexo A.</w:t>
       </w:r>
     </w:p>
     <w:p>
@@ -7402,6 +7457,2008 @@
       </w:r>
       <w:r>
         <w:t xml:space="preserve">&gt; [EDITAR].</w:t>
+      </w:r>
+    </w:p>
+    <w:p>
+      <w:r>
+        <w:pict>
+          <v:rect style="width:0;height:1.5pt" o:hralign="center" o:hrstd="t" o:hr="t"/>
+        </w:pict>
+      </w:r>
+    </w:p>
+    <w:p>
+      <w:pPr>
+        <w:pStyle w:val="Heading2"/>
+      </w:pPr>
+      <w:bookmarkStart w:id="23" w:name="_08d56eb61c2e47b6b869db13a032d3f90195bda"/>
+      <w:r>
+        <w:t xml:space="preserve">Anexo A — Acta de la sesión formal de aceptación con el cliente</w:t>
+      </w:r>
+      <w:bookmarkEnd w:id="23"/>
+    </w:p>
+    <w:p>
+      <w:pPr>
+        <w:pStyle w:val="FirstParagraph"/>
+      </w:pPr>
+      <w:r>
+        <w:rPr>
+          <w:i/>
+          <w:iCs/>
+        </w:rPr>
+        <w:t xml:space="preserve">(texto completo de</w:t>
+      </w:r>
+      <w:r>
+        <w:rPr>
+          <w:i/>
+          <w:iCs/>
+        </w:rPr>
+        <w:t xml:space="preserve"> </w:t>
+      </w:r>
+      <w:r>
+        <w:rPr>
+          <w:rStyle w:val="VerbatimChar"/>
+          <w:i/>
+          <w:iCs/>
+        </w:rPr>
+        <w:t xml:space="preserve">docs/entregable2/sesion-aceptacion.md</w:t>
+      </w:r>
+      <w:r>
+        <w:rPr>
+          <w:i/>
+          <w:iCs/>
+        </w:rPr>
+        <w:t xml:space="preserve">)</w:t>
+      </w:r>
+    </w:p>
+    <w:p>
+      <w:pPr>
+        <w:pStyle w:val="Heading3"/>
+      </w:pPr>
+      <w:bookmarkStart w:id="24" w:name="_40e0b479020e6c1a134cd7d50ae59d2108b3847"/>
+      <w:r>
+        <w:t xml:space="preserve">A.1 Datos de la sesión</w:t>
+      </w:r>
+      <w:bookmarkEnd w:id="24"/>
+    </w:p>
+    <w:tbl>
+      <w:tblPr>
+        <w:tblStyle w:val="Table"/>
+        <w:tblW w:type="pct" w:w="5000"/>
+        <w:tblLayout w:type="fixed"/>
+        <w:tblLook w:firstRow="1" w:lastRow="0" w:firstColumn="0" w:lastColumn="0" w:noHBand="0" w:noVBand="0" w:val="0020"/>
+      </w:tblPr>
+      <w:tblGrid>
+        <w:gridCol w:w="3960"/>
+        <w:gridCol w:w="3960"/>
+      </w:tblGrid>
+      <w:tr>
+        <w:trPr>
+          <w:tblHeader w:val="on"/>
+        </w:trPr>
+        <w:tc>
+          <w:tcPr/>
+          <w:p>
+            <w:pPr>
+              <w:pStyle w:val="Compact"/>
+            </w:pPr>
+            <w:r>
+              <w:t xml:space="preserve">Campo</w:t>
+            </w:r>
+          </w:p>
+        </w:tc>
+        <w:tc>
+          <w:tcPr/>
+          <w:p>
+            <w:pPr>
+              <w:pStyle w:val="Compact"/>
+            </w:pPr>
+            <w:r>
+              <w:t xml:space="preserve">Valor</w:t>
+            </w:r>
+          </w:p>
+        </w:tc>
+      </w:tr>
+      <w:tr>
+        <w:tc>
+          <w:tcPr/>
+          <w:p>
+            <w:pPr>
+              <w:pStyle w:val="Compact"/>
+            </w:pPr>
+            <w:r>
+              <w:t xml:space="preserve">Fecha</w:t>
+            </w:r>
+          </w:p>
+        </w:tc>
+        <w:tc>
+          <w:tcPr/>
+          <w:p>
+            <w:pPr>
+              <w:pStyle w:val="Compact"/>
+            </w:pPr>
+            <w:r>
+              <w:t xml:space="preserve">2026-10-19</w:t>
+            </w:r>
+          </w:p>
+        </w:tc>
+      </w:tr>
+      <w:tr>
+        <w:tc>
+          <w:tcPr/>
+          <w:p>
+            <w:pPr>
+              <w:pStyle w:val="Compact"/>
+            </w:pPr>
+            <w:r>
+              <w:t xml:space="preserve">Hora de inicio / término</w:t>
+            </w:r>
+          </w:p>
+        </w:tc>
+        <w:tc>
+          <w:tcPr/>
+          <w:p>
+            <w:pPr>
+              <w:pStyle w:val="Compact"/>
+            </w:pPr>
+            <w:r>
+              <w:t xml:space="preserve">00:15 / 00:38</w:t>
+            </w:r>
+          </w:p>
+        </w:tc>
+      </w:tr>
+      <w:tr>
+        <w:tc>
+          <w:tcPr/>
+          <w:p>
+            <w:pPr>
+              <w:pStyle w:val="Compact"/>
+            </w:pPr>
+            <w:r>
+              <w:t xml:space="preserve">Medio</w:t>
+            </w:r>
+          </w:p>
+        </w:tc>
+        <w:tc>
+          <w:tcPr/>
+          <w:p>
+            <w:pPr>
+              <w:pStyle w:val="Compact"/>
+            </w:pPr>
+            <w:r>
+              <w:t xml:space="preserve">Videollamada</w:t>
+            </w:r>
+          </w:p>
+        </w:tc>
+      </w:tr>
+      <w:tr>
+        <w:tc>
+          <w:tcPr/>
+          <w:p>
+            <w:pPr>
+              <w:pStyle w:val="Compact"/>
+            </w:pPr>
+            <w:r>
+              <w:t xml:space="preserve">Representante del Cliente</w:t>
+            </w:r>
+          </w:p>
+        </w:tc>
+        <w:tc>
+          <w:tcPr/>
+          <w:p>
+            <w:pPr>
+              <w:pStyle w:val="Compact"/>
+            </w:pPr>
+            <w:r>
+              <w:t xml:space="preserve">Rodrigo Guerrero</w:t>
+            </w:r>
+          </w:p>
+        </w:tc>
+      </w:tr>
+      <w:tr>
+        <w:tc>
+          <w:tcPr/>
+          <w:p>
+            <w:pPr>
+              <w:pStyle w:val="Compact"/>
+            </w:pPr>
+            <w:r>
+              <w:t xml:space="preserve">Demostración</w:t>
+            </w:r>
+          </w:p>
+        </w:tc>
+        <w:tc>
+          <w:tcPr/>
+          <w:p>
+            <w:pPr>
+              <w:pStyle w:val="Compact"/>
+            </w:pPr>
+            <w:r>
+              <w:t xml:space="preserve">Lester González</w:t>
+            </w:r>
+          </w:p>
+        </w:tc>
+      </w:tr>
+      <w:tr>
+        <w:tc>
+          <w:tcPr/>
+          <w:p>
+            <w:pPr>
+              <w:pStyle w:val="Compact"/>
+            </w:pPr>
+            <w:r>
+              <w:t xml:space="preserve">Acta</w:t>
+            </w:r>
+          </w:p>
+        </w:tc>
+        <w:tc>
+          <w:tcPr/>
+          <w:p>
+            <w:pPr>
+              <w:pStyle w:val="Compact"/>
+            </w:pPr>
+            <w:r>
+              <w:t xml:space="preserve">Lester González</w:t>
+            </w:r>
+          </w:p>
+        </w:tc>
+      </w:tr>
+      <w:tr>
+        <w:tc>
+          <w:tcPr/>
+          <w:p>
+            <w:pPr>
+              <w:pStyle w:val="Compact"/>
+            </w:pPr>
+            <w:r>
+              <w:t xml:space="preserve">Otros asistentes</w:t>
+            </w:r>
+          </w:p>
+        </w:tc>
+        <w:tc>
+          <w:tcPr/>
+          <w:p>
+            <w:pPr>
+              <w:pStyle w:val="Compact"/>
+            </w:pPr>
+            <w:r>
+              <w:t xml:space="preserve">Angel Salgado</w:t>
+            </w:r>
+          </w:p>
+        </w:tc>
+      </w:tr>
+      <w:tr>
+        <w:tc>
+          <w:tcPr/>
+          <w:p>
+            <w:pPr>
+              <w:pStyle w:val="Compact"/>
+            </w:pPr>
+            <w:r>
+              <w:t xml:space="preserve">Versión demostrada</w:t>
+            </w:r>
+          </w:p>
+        </w:tc>
+        <w:tc>
+          <w:tcPr/>
+          <w:p>
+            <w:pPr>
+              <w:pStyle w:val="Compact"/>
+            </w:pPr>
+            <w:r>
+              <w:rPr>
+                <w:rStyle w:val="VerbatimChar"/>
+              </w:rPr>
+              <w:t xml:space="preserve">main</w:t>
+            </w:r>
+            <w:r>
+              <w:t xml:space="preserve"> </w:t>
+            </w:r>
+            <w:r>
+              <w:t xml:space="preserve">en el commit</w:t>
+            </w:r>
+            <w:r>
+              <w:t xml:space="preserve"> </w:t>
+            </w:r>
+            <w:r>
+              <w:rPr>
+                <w:rStyle w:val="VerbatimChar"/>
+              </w:rPr>
+              <w:t xml:space="preserve">b9f5f2d</w:t>
+            </w:r>
+          </w:p>
+        </w:tc>
+      </w:tr>
+      <w:tr>
+        <w:tc>
+          <w:tcPr/>
+          <w:p>
+            <w:pPr>
+              <w:pStyle w:val="Compact"/>
+            </w:pPr>
+            <w:r>
+              <w:t xml:space="preserve">Preparación del entorno</w:t>
+            </w:r>
+          </w:p>
+        </w:tc>
+        <w:tc>
+          <w:tcPr/>
+          <w:p>
+            <w:pPr>
+              <w:pStyle w:val="Compact"/>
+            </w:pPr>
+            <w:r>
+              <w:rPr>
+                <w:rStyle w:val="VerbatimChar"/>
+              </w:rPr>
+              <w:t xml:space="preserve">rm -f data/mira.db*</w:t>
+            </w:r>
+            <w:r>
+              <w:t xml:space="preserve"> </w:t>
+            </w:r>
+            <w:r>
+              <w:t xml:space="preserve">y</w:t>
+            </w:r>
+            <w:r>
+              <w:t xml:space="preserve"> </w:t>
+            </w:r>
+            <w:r>
+              <w:rPr>
+                <w:rStyle w:val="VerbatimChar"/>
+              </w:rPr>
+              <w:t xml:space="preserve">npm run db:seed</w:t>
+            </w:r>
+            <w:r>
+              <w:t xml:space="preserve"> </w:t>
+            </w:r>
+            <w:r>
+              <w:t xml:space="preserve">(base sembrada el 2026-10-18 a las 23:58);</w:t>
+            </w:r>
+            <w:r>
+              <w:t xml:space="preserve"> </w:t>
+            </w:r>
+            <w:r>
+              <w:rPr>
+                <w:rStyle w:val="VerbatimChar"/>
+              </w:rPr>
+              <w:t xml:space="preserve">npm run dev</w:t>
+            </w:r>
+            <w:r>
+              <w:t xml:space="preserve">; navegador</w:t>
+            </w:r>
+          </w:p>
+        </w:tc>
+      </w:tr>
+    </w:tbl>
+    <w:p>
+      <w:pPr>
+        <w:pStyle w:val="FirstParagraph"/>
+      </w:pPr>
+      <w:r>
+        <w:rPr>
+          <w:b/>
+          <w:bCs/>
+        </w:rPr>
+        <w:t xml:space="preserve">Declaración de rol:</w:t>
+      </w:r>
+      <w:r>
+        <w:t xml:space="preserve"> </w:t>
+      </w:r>
+      <w:r>
+        <w:t xml:space="preserve">Rodrigo Guerrero integra el equipo desarrollador (backend) y actúa como Representante del Cliente por asignación del taller. La aceptación se registra bajo ese rol.</w:t>
+      </w:r>
+    </w:p>
+    <w:p>
+      <w:pPr>
+        <w:pStyle w:val="BodyText"/>
+      </w:pPr>
+      <w:r>
+        <w:rPr>
+          <w:b/>
+          <w:bCs/>
+        </w:rPr>
+        <w:t xml:space="preserve">Alcance:</w:t>
+      </w:r>
+      <w:r>
+        <w:t xml:space="preserve"> </w:t>
+      </w:r>
+      <w:r>
+        <w:t xml:space="preserve">incluido F5 (configuración de umbrales con doble control) y F4 (evaluación de casos por umbrales). Fuera de alcance de este incremento: la decisión final humana del Operador sobre casos derivados (</w:t>
+      </w:r>
+      <w:r>
+        <w:rPr>
+          <w:rStyle w:val="VerbatimChar"/>
+        </w:rPr>
+        <w:t xml:space="preserve">spec.md</w:t>
+      </w:r>
+      <w:r>
+        <w:t xml:space="preserve">, supuesto (f)) y el SLA numérico (</w:t>
+      </w:r>
+      <w:r>
+        <w:rPr>
+          <w:rStyle w:val="VerbatimChar"/>
+        </w:rPr>
+        <w:t xml:space="preserve">H-11</w:t>
+      </w:r>
+      <w:r>
+        <w:t xml:space="preserve">).</w:t>
+      </w:r>
+    </w:p>
+    <w:p>
+      <w:pPr>
+        <w:pStyle w:val="Heading3"/>
+      </w:pPr>
+      <w:bookmarkStart w:id="25" w:name="_ad317ae78e5323cba4c776efe79755642ced929"/>
+      <w:r>
+        <w:t xml:space="preserve">A.2 Escenarios demostrados</w:t>
+      </w:r>
+      <w:bookmarkEnd w:id="25"/>
+    </w:p>
+    <w:tbl>
+      <w:tblPr>
+        <w:tblStyle w:val="Table"/>
+        <w:tblW w:type="pct" w:w="5000"/>
+        <w:tblLayout w:type="fixed"/>
+        <w:tblLook w:firstRow="1" w:lastRow="0" w:firstColumn="0" w:lastColumn="0" w:noHBand="0" w:noVBand="0" w:val="0020"/>
+      </w:tblPr>
+      <w:tblGrid>
+        <w:gridCol w:w="1131"/>
+        <w:gridCol w:w="1131"/>
+        <w:gridCol w:w="1131"/>
+        <w:gridCol w:w="1131"/>
+        <w:gridCol w:w="1131"/>
+        <w:gridCol w:w="1131"/>
+        <w:gridCol w:w="1131"/>
+      </w:tblGrid>
+      <w:tr>
+        <w:trPr>
+          <w:tblHeader w:val="on"/>
+        </w:trPr>
+        <w:tc>
+          <w:tcPr/>
+          <w:p>
+            <w:pPr>
+              <w:pStyle w:val="Compact"/>
+            </w:pPr>
+            <w:r>
+              <w:t xml:space="preserve">#</w:t>
+            </w:r>
+          </w:p>
+        </w:tc>
+        <w:tc>
+          <w:tcPr/>
+          <w:p>
+            <w:pPr>
+              <w:pStyle w:val="Compact"/>
+            </w:pPr>
+            <w:r>
+              <w:t xml:space="preserve">Escenario</w:t>
+            </w:r>
+          </w:p>
+        </w:tc>
+        <w:tc>
+          <w:tcPr/>
+          <w:p>
+            <w:pPr>
+              <w:pStyle w:val="Compact"/>
+            </w:pPr>
+            <w:r>
+              <w:t xml:space="preserve">Pasos resumidos</w:t>
+            </w:r>
+          </w:p>
+        </w:tc>
+        <w:tc>
+          <w:tcPr/>
+          <w:p>
+            <w:pPr>
+              <w:pStyle w:val="Compact"/>
+            </w:pPr>
+            <w:r>
+              <w:t xml:space="preserve">Resultado esperado</w:t>
+            </w:r>
+          </w:p>
+        </w:tc>
+        <w:tc>
+          <w:tcPr/>
+          <w:p>
+            <w:pPr>
+              <w:pStyle w:val="Compact"/>
+            </w:pPr>
+            <w:r>
+              <w:t xml:space="preserve">Criterio</w:t>
+            </w:r>
+          </w:p>
+        </w:tc>
+        <w:tc>
+          <w:tcPr/>
+          <w:p>
+            <w:pPr>
+              <w:pStyle w:val="Compact"/>
+            </w:pPr>
+            <w:r>
+              <w:t xml:space="preserve">Resultado observado</w:t>
+            </w:r>
+          </w:p>
+        </w:tc>
+        <w:tc>
+          <w:tcPr/>
+          <w:p>
+            <w:pPr>
+              <w:pStyle w:val="Compact"/>
+            </w:pPr>
+            <w:r>
+              <w:t xml:space="preserve">Decisión</w:t>
+            </w:r>
+          </w:p>
+        </w:tc>
+      </w:tr>
+      <w:tr>
+        <w:tc>
+          <w:tcPr/>
+          <w:p>
+            <w:pPr>
+              <w:pStyle w:val="Compact"/>
+            </w:pPr>
+            <w:r>
+              <w:t xml:space="preserve">1</w:t>
+            </w:r>
+          </w:p>
+        </w:tc>
+        <w:tc>
+          <w:tcPr/>
+          <w:p>
+            <w:pPr>
+              <w:pStyle w:val="Compact"/>
+            </w:pPr>
+            <w:r>
+              <w:t xml:space="preserve">Consultar la política vigente (F5)</w:t>
+            </w:r>
+          </w:p>
+        </w:tc>
+        <w:tc>
+          <w:tcPr/>
+          <w:p>
+            <w:pPr>
+              <w:pStyle w:val="Compact"/>
+            </w:pPr>
+            <w:r>
+              <w:t xml:space="preserve">Abrir la pestaña de umbrales</w:t>
+            </w:r>
+          </w:p>
+        </w:tc>
+        <w:tc>
+          <w:tcPr/>
+          <w:p>
+            <w:pPr>
+              <w:pStyle w:val="Compact"/>
+            </w:pPr>
+            <w:r>
+              <w:t xml:space="preserve">Se muestra la versión vigente (v1)</w:t>
+            </w:r>
+          </w:p>
+        </w:tc>
+        <w:tc>
+          <w:tcPr/>
+          <w:p>
+            <w:pPr>
+              <w:pStyle w:val="Compact"/>
+            </w:pPr>
+            <w:r>
+              <w:t xml:space="preserve">—</w:t>
+            </w:r>
+          </w:p>
+        </w:tc>
+        <w:tc>
+          <w:tcPr/>
+          <w:p>
+            <w:pPr>
+              <w:pStyle w:val="Compact"/>
+            </w:pPr>
+            <w:r>
+              <w:t xml:space="preserve">Versión 1, umbral de aprobación 90, cargada por el sistema.</w:t>
+            </w:r>
+          </w:p>
+        </w:tc>
+        <w:tc>
+          <w:tcPr/>
+          <w:p>
+            <w:pPr>
+              <w:pStyle w:val="Compact"/>
+            </w:pPr>
+            <w:r>
+              <w:t xml:space="preserve">Sí</w:t>
+            </w:r>
+          </w:p>
+        </w:tc>
+      </w:tr>
+      <w:tr>
+        <w:tc>
+          <w:tcPr/>
+          <w:p>
+            <w:pPr>
+              <w:pStyle w:val="Compact"/>
+            </w:pPr>
+            <w:r>
+              <w:t xml:space="preserve">2</w:t>
+            </w:r>
+          </w:p>
+        </w:tc>
+        <w:tc>
+          <w:tcPr/>
+          <w:p>
+            <w:pPr>
+              <w:pStyle w:val="Compact"/>
+            </w:pPr>
+            <w:r>
+              <w:t xml:space="preserve">Proponer una nueva versión (F5)</w:t>
+            </w:r>
+          </w:p>
+        </w:tc>
+        <w:tc>
+          <w:tcPr/>
+          <w:p>
+            <w:pPr>
+              <w:pStyle w:val="Compact"/>
+            </w:pPr>
+            <w:r>
+              <w:t xml:space="preserve">Como Diseñador 1, proponer umbral de aprobación 92</w:t>
+            </w:r>
+          </w:p>
+        </w:tc>
+        <w:tc>
+          <w:tcPr/>
+          <w:p>
+            <w:pPr>
+              <w:pStyle w:val="Compact"/>
+            </w:pPr>
+            <w:r>
+              <w:t xml:space="preserve">Se crea un borrador con versión correlativa</w:t>
+            </w:r>
+          </w:p>
+        </w:tc>
+        <w:tc>
+          <w:tcPr/>
+          <w:p>
+            <w:pPr>
+              <w:pStyle w:val="Compact"/>
+            </w:pPr>
+            <w:r>
+              <w:t xml:space="preserve">—</w:t>
+            </w:r>
+          </w:p>
+        </w:tc>
+        <w:tc>
+          <w:tcPr/>
+          <w:p>
+            <w:pPr>
+              <w:pStyle w:val="Compact"/>
+            </w:pPr>
+            <w:r>
+              <w:t xml:space="preserve">Versión 2 propuesta (00:19).</w:t>
+            </w:r>
+          </w:p>
+        </w:tc>
+        <w:tc>
+          <w:tcPr/>
+          <w:p>
+            <w:pPr>
+              <w:pStyle w:val="Compact"/>
+            </w:pPr>
+            <w:r>
+              <w:t xml:space="preserve">Sí</w:t>
+            </w:r>
+          </w:p>
+        </w:tc>
+      </w:tr>
+      <w:tr>
+        <w:tc>
+          <w:tcPr/>
+          <w:p>
+            <w:pPr>
+              <w:pStyle w:val="Compact"/>
+            </w:pPr>
+            <w:r>
+              <w:t xml:space="preserve">3</w:t>
+            </w:r>
+          </w:p>
+        </w:tc>
+        <w:tc>
+          <w:tcPr/>
+          <w:p>
+            <w:pPr>
+              <w:pStyle w:val="Compact"/>
+            </w:pPr>
+            <w:r>
+              <w:t xml:space="preserve">Doble control (F5)</w:t>
+            </w:r>
+          </w:p>
+        </w:tc>
+        <w:tc>
+          <w:tcPr/>
+          <w:p>
+            <w:pPr>
+              <w:pStyle w:val="Compact"/>
+            </w:pPr>
+            <w:r>
+              <w:t xml:space="preserve">Intentar aprobar como el mismo proponente; intentar proponer como Administrador</w:t>
+            </w:r>
+          </w:p>
+        </w:tc>
+        <w:tc>
+          <w:tcPr/>
+          <w:p>
+            <w:pPr>
+              <w:pStyle w:val="Compact"/>
+            </w:pPr>
+            <w:r>
+              <w:t xml:space="preserve">Ambos intentos son rechazados</w:t>
+            </w:r>
+          </w:p>
+        </w:tc>
+        <w:tc>
+          <w:tcPr/>
+          <w:p>
+            <w:pPr>
+              <w:pStyle w:val="Compact"/>
+            </w:pPr>
+            <w:r>
+              <w:t xml:space="preserve">—</w:t>
+            </w:r>
+          </w:p>
+        </w:tc>
+        <w:tc>
+          <w:tcPr/>
+          <w:p>
+            <w:pPr>
+              <w:pStyle w:val="Compact"/>
+            </w:pPr>
+            <w:r>
+              <w:t xml:space="preserve">Bloqueado como esperado; cubierto además por</w:t>
+            </w:r>
+            <w:r>
+              <w:t xml:space="preserve"> </w:t>
+            </w:r>
+            <w:r>
+              <w:rPr>
+                <w:rStyle w:val="VerbatimChar"/>
+              </w:rPr>
+              <w:t xml:space="preserve">tests/integration/umbrales-api.test.ts</w:t>
+            </w:r>
+            <w:r>
+              <w:t xml:space="preserve">.</w:t>
+            </w:r>
+          </w:p>
+        </w:tc>
+        <w:tc>
+          <w:tcPr/>
+          <w:p>
+            <w:pPr>
+              <w:pStyle w:val="Compact"/>
+            </w:pPr>
+            <w:r>
+              <w:t xml:space="preserve">Sí</w:t>
+            </w:r>
+          </w:p>
+        </w:tc>
+      </w:tr>
+      <w:tr>
+        <w:tc>
+          <w:tcPr/>
+          <w:p>
+            <w:pPr>
+              <w:pStyle w:val="Compact"/>
+            </w:pPr>
+            <w:r>
+              <w:t xml:space="preserve">4</w:t>
+            </w:r>
+          </w:p>
+        </w:tc>
+        <w:tc>
+          <w:tcPr/>
+          <w:p>
+            <w:pPr>
+              <w:pStyle w:val="Compact"/>
+            </w:pPr>
+            <w:r>
+              <w:t xml:space="preserve">Aprobación independiente (F5)</w:t>
+            </w:r>
+          </w:p>
+        </w:tc>
+        <w:tc>
+          <w:tcPr/>
+          <w:p>
+            <w:pPr>
+              <w:pStyle w:val="Compact"/>
+            </w:pPr>
+            <w:r>
+              <w:t xml:space="preserve">Cambiar a Administrador 1 y aprobar</w:t>
+            </w:r>
+          </w:p>
+        </w:tc>
+        <w:tc>
+          <w:tcPr/>
+          <w:p>
+            <w:pPr>
+              <w:pStyle w:val="Compact"/>
+            </w:pPr>
+            <w:r>
+              <w:t xml:space="preserve">La versión 2 entra en vigencia; la 1 queda en el historial</w:t>
+            </w:r>
+          </w:p>
+        </w:tc>
+        <w:tc>
+          <w:tcPr/>
+          <w:p>
+            <w:pPr>
+              <w:pStyle w:val="Compact"/>
+            </w:pPr>
+            <w:r>
+              <w:t xml:space="preserve">—</w:t>
+            </w:r>
+          </w:p>
+        </w:tc>
+        <w:tc>
+          <w:tcPr/>
+          <w:p>
+            <w:pPr>
+              <w:pStyle w:val="Compact"/>
+            </w:pPr>
+            <w:r>
+              <w:t xml:space="preserve">Aprobada a las 00:21.</w:t>
+            </w:r>
+          </w:p>
+        </w:tc>
+        <w:tc>
+          <w:tcPr/>
+          <w:p>
+            <w:pPr>
+              <w:pStyle w:val="Compact"/>
+            </w:pPr>
+            <w:r>
+              <w:t xml:space="preserve">Sí</w:t>
+            </w:r>
+          </w:p>
+        </w:tc>
+      </w:tr>
+      <w:tr>
+        <w:tc>
+          <w:tcPr/>
+          <w:p>
+            <w:pPr>
+              <w:pStyle w:val="Compact"/>
+            </w:pPr>
+            <w:r>
+              <w:t xml:space="preserve">5</w:t>
+            </w:r>
+          </w:p>
+        </w:tc>
+        <w:tc>
+          <w:tcPr/>
+          <w:p>
+            <w:pPr>
+              <w:pStyle w:val="Compact"/>
+            </w:pPr>
+            <w:r>
+              <w:t xml:space="preserve">Historial de versiones (F5)</w:t>
+            </w:r>
+          </w:p>
+        </w:tc>
+        <w:tc>
+          <w:tcPr/>
+          <w:p>
+            <w:pPr>
+              <w:pStyle w:val="Compact"/>
+            </w:pPr>
+            <w:r>
+              <w:t xml:space="preserve">Abrir el historial</w:t>
+            </w:r>
+          </w:p>
+        </w:tc>
+        <w:tc>
+          <w:tcPr/>
+          <w:p>
+            <w:pPr>
+              <w:pStyle w:val="Compact"/>
+            </w:pPr>
+            <w:r>
+              <w:t xml:space="preserve">Se listan las versiones; las cerradas no son modificables</w:t>
+            </w:r>
+          </w:p>
+        </w:tc>
+        <w:tc>
+          <w:tcPr/>
+          <w:p>
+            <w:pPr>
+              <w:pStyle w:val="Compact"/>
+            </w:pPr>
+            <w:r>
+              <w:t xml:space="preserve">—</w:t>
+            </w:r>
+          </w:p>
+        </w:tc>
+        <w:tc>
+          <w:tcPr/>
+          <w:p>
+            <w:pPr>
+              <w:pStyle w:val="Compact"/>
+            </w:pPr>
+            <w:r>
+              <w:t xml:space="preserve">Lista v1 (carga inicial), v2 (Diseñador 1 → Administrador 1) y v3 (Diseñador 1 → Administrador 2, 00:38). Inmutabilidad verificada por</w:t>
+            </w:r>
+            <w:r>
+              <w:t xml:space="preserve"> </w:t>
+            </w:r>
+            <w:r>
+              <w:rPr>
+                <w:rStyle w:val="VerbatimChar"/>
+              </w:rPr>
+              <w:t xml:space="preserve">tests/integration/auditoria-inmutable.test.ts</w:t>
+            </w:r>
+            <w:r>
+              <w:t xml:space="preserve">.</w:t>
+            </w:r>
+          </w:p>
+        </w:tc>
+        <w:tc>
+          <w:tcPr/>
+          <w:p>
+            <w:pPr>
+              <w:pStyle w:val="Compact"/>
+            </w:pPr>
+            <w:r>
+              <w:t xml:space="preserve">Sí</w:t>
+            </w:r>
+          </w:p>
+        </w:tc>
+      </w:tr>
+      <w:tr>
+        <w:tc>
+          <w:tcPr/>
+          <w:p>
+            <w:pPr>
+              <w:pStyle w:val="Compact"/>
+            </w:pPr>
+            <w:r>
+              <w:t xml:space="preserve">6</w:t>
+            </w:r>
+          </w:p>
+        </w:tc>
+        <w:tc>
+          <w:tcPr/>
+          <w:p>
+            <w:pPr>
+              <w:pStyle w:val="Compact"/>
+            </w:pPr>
+            <w:r>
+              <w:t xml:space="preserve">CASO-MED-001 (F4)</w:t>
+            </w:r>
+          </w:p>
+        </w:tc>
+        <w:tc>
+          <w:tcPr/>
+          <w:p>
+            <w:pPr>
+              <w:pStyle w:val="Compact"/>
+            </w:pPr>
+            <w:r>
+              <w:t xml:space="preserve">Evaluar el caso</w:t>
+            </w:r>
+          </w:p>
+        </w:tc>
+        <w:tc>
+          <w:tcPr/>
+          <w:p>
+            <w:pPr>
+              <w:pStyle w:val="Compact"/>
+            </w:pPr>
+            <w:r>
+              <w:rPr>
+                <w:rStyle w:val="VerbatimChar"/>
+              </w:rPr>
+              <w:t xml:space="preserve">APROBADO_AUTOMATICO</w:t>
+            </w:r>
+          </w:p>
+        </w:tc>
+        <w:tc>
+          <w:tcPr/>
+          <w:p>
+            <w:pPr>
+              <w:pStyle w:val="Compact"/>
+            </w:pPr>
+            <w:r>
+              <w:t xml:space="preserve">AC-1</w:t>
+            </w:r>
+          </w:p>
+        </w:tc>
+        <w:tc>
+          <w:tcPr/>
+          <w:p>
+            <w:pPr>
+              <w:pStyle w:val="Compact"/>
+            </w:pPr>
+            <w:r>
+              <w:t xml:space="preserve">Puntaje 94,</w:t>
+            </w:r>
+            <w:r>
+              <w:t xml:space="preserve"> </w:t>
+            </w:r>
+            <w:r>
+              <w:rPr>
+                <w:rStyle w:val="VerbatimChar"/>
+              </w:rPr>
+              <w:t xml:space="preserve">aprobado</w:t>
+            </w:r>
+            <w:r>
+              <w:t xml:space="preserve">,</w:t>
+            </w:r>
+            <w:r>
+              <w:t xml:space="preserve"> </w:t>
+            </w:r>
+            <w:r>
+              <w:rPr>
+                <w:rStyle w:val="VerbatimChar"/>
+              </w:rPr>
+              <w:t xml:space="preserve">riesgoAltoRechazo: false</w:t>
+            </w:r>
+            <w:r>
+              <w:t xml:space="preserve">.</w:t>
+            </w:r>
+          </w:p>
+        </w:tc>
+        <w:tc>
+          <w:tcPr/>
+          <w:p>
+            <w:pPr>
+              <w:pStyle w:val="Compact"/>
+            </w:pPr>
+            <w:r>
+              <w:t xml:space="preserve">Sí</w:t>
+            </w:r>
+          </w:p>
+        </w:tc>
+      </w:tr>
+      <w:tr>
+        <w:tc>
+          <w:tcPr/>
+          <w:p>
+            <w:pPr>
+              <w:pStyle w:val="Compact"/>
+            </w:pPr>
+            <w:r>
+              <w:t xml:space="preserve">7</w:t>
+            </w:r>
+          </w:p>
+        </w:tc>
+        <w:tc>
+          <w:tcPr/>
+          <w:p>
+            <w:pPr>
+              <w:pStyle w:val="Compact"/>
+            </w:pPr>
+            <w:r>
+              <w:t xml:space="preserve">CASO-MED-002 (F4)</w:t>
+            </w:r>
+          </w:p>
+        </w:tc>
+        <w:tc>
+          <w:tcPr/>
+          <w:p>
+            <w:pPr>
+              <w:pStyle w:val="Compact"/>
+            </w:pPr>
+            <w:r>
+              <w:t xml:space="preserve">Evaluar el caso</w:t>
+            </w:r>
+          </w:p>
+        </w:tc>
+        <w:tc>
+          <w:tcPr/>
+          <w:p>
+            <w:pPr>
+              <w:pStyle w:val="Compact"/>
+            </w:pPr>
+            <w:r>
+              <w:rPr>
+                <w:rStyle w:val="VerbatimChar"/>
+              </w:rPr>
+              <w:t xml:space="preserve">DERIVADO_REVISION</w:t>
+            </w:r>
+            <w:r>
+              <w:t xml:space="preserve"> </w:t>
+            </w:r>
+            <w:r>
+              <w:t xml:space="preserve">por</w:t>
+            </w:r>
+            <w:r>
+              <w:t xml:space="preserve"> </w:t>
+            </w:r>
+            <w:r>
+              <w:rPr>
+                <w:rStyle w:val="VerbatimChar"/>
+              </w:rPr>
+              <w:t xml:space="preserve">senal_bajo_minimo</w:t>
+            </w:r>
+          </w:p>
+        </w:tc>
+        <w:tc>
+          <w:tcPr/>
+          <w:p>
+            <w:pPr>
+              <w:pStyle w:val="Compact"/>
+            </w:pPr>
+            <w:r>
+              <w:t xml:space="preserve">AC-2</w:t>
+            </w:r>
+          </w:p>
+        </w:tc>
+        <w:tc>
+          <w:tcPr/>
+          <w:p>
+            <w:pPr>
+              <w:pStyle w:val="Compact"/>
+            </w:pPr>
+            <w:r>
+              <w:t xml:space="preserve">Puntaje 91, coherencia 55 &lt; 60. Evaluado dos veces (00:24, 00:28) con el mismo resultado.</w:t>
+            </w:r>
+          </w:p>
+        </w:tc>
+        <w:tc>
+          <w:tcPr/>
+          <w:p>
+            <w:pPr>
+              <w:pStyle w:val="Compact"/>
+            </w:pPr>
+            <w:r>
+              <w:t xml:space="preserve">Sí</w:t>
+            </w:r>
+          </w:p>
+        </w:tc>
+      </w:tr>
+      <w:tr>
+        <w:tc>
+          <w:tcPr/>
+          <w:p>
+            <w:pPr>
+              <w:pStyle w:val="Compact"/>
+            </w:pPr>
+            <w:r>
+              <w:t xml:space="preserve">8</w:t>
+            </w:r>
+          </w:p>
+        </w:tc>
+        <w:tc>
+          <w:tcPr/>
+          <w:p>
+            <w:pPr>
+              <w:pStyle w:val="Compact"/>
+            </w:pPr>
+            <w:r>
+              <w:t xml:space="preserve">CASO-MED-003 (F4)</w:t>
+            </w:r>
+          </w:p>
+        </w:tc>
+        <w:tc>
+          <w:tcPr/>
+          <w:p>
+            <w:pPr>
+              <w:pStyle w:val="Compact"/>
+            </w:pPr>
+            <w:r>
+              <w:t xml:space="preserve">Evaluar el caso</w:t>
+            </w:r>
+          </w:p>
+        </w:tc>
+        <w:tc>
+          <w:tcPr/>
+          <w:p>
+            <w:pPr>
+              <w:pStyle w:val="Compact"/>
+            </w:pPr>
+            <w:r>
+              <w:rPr>
+                <w:rStyle w:val="VerbatimChar"/>
+              </w:rPr>
+              <w:t xml:space="preserve">DERIVADO_REVISION</w:t>
+            </w:r>
+            <w:r>
+              <w:t xml:space="preserve"> </w:t>
+            </w:r>
+            <w:r>
+              <w:t xml:space="preserve">por</w:t>
+            </w:r>
+            <w:r>
+              <w:t xml:space="preserve"> </w:t>
+            </w:r>
+            <w:r>
+              <w:rPr>
+                <w:rStyle w:val="VerbatimChar"/>
+              </w:rPr>
+              <w:t xml:space="preserve">alerta_fraude</w:t>
+            </w:r>
+          </w:p>
+        </w:tc>
+        <w:tc>
+          <w:tcPr/>
+          <w:p>
+            <w:pPr>
+              <w:pStyle w:val="Compact"/>
+            </w:pPr>
+            <w:r>
+              <w:t xml:space="preserve">AC-3</w:t>
+            </w:r>
+          </w:p>
+        </w:tc>
+        <w:tc>
+          <w:tcPr/>
+          <w:p>
+            <w:pPr>
+              <w:pStyle w:val="Compact"/>
+            </w:pPr>
+            <w:r>
+              <w:t xml:space="preserve">Puntaje 94 con fraude activo; deriva igual.</w:t>
+            </w:r>
+          </w:p>
+        </w:tc>
+        <w:tc>
+          <w:tcPr/>
+          <w:p>
+            <w:pPr>
+              <w:pStyle w:val="Compact"/>
+            </w:pPr>
+            <w:r>
+              <w:t xml:space="preserve">Sí</w:t>
+            </w:r>
+          </w:p>
+        </w:tc>
+      </w:tr>
+      <w:tr>
+        <w:tc>
+          <w:tcPr/>
+          <w:p>
+            <w:pPr>
+              <w:pStyle w:val="Compact"/>
+            </w:pPr>
+            <w:r>
+              <w:t xml:space="preserve">9</w:t>
+            </w:r>
+          </w:p>
+        </w:tc>
+        <w:tc>
+          <w:tcPr/>
+          <w:p>
+            <w:pPr>
+              <w:pStyle w:val="Compact"/>
+            </w:pPr>
+            <w:r>
+              <w:t xml:space="preserve">CASO-MED-004 y 006 (F4)</w:t>
+            </w:r>
+          </w:p>
+        </w:tc>
+        <w:tc>
+          <w:tcPr/>
+          <w:p>
+            <w:pPr>
+              <w:pStyle w:val="Compact"/>
+            </w:pPr>
+            <w:r>
+              <w:t xml:space="preserve">Evaluar ambos</w:t>
+            </w:r>
+          </w:p>
+        </w:tc>
+        <w:tc>
+          <w:tcPr/>
+          <w:p>
+            <w:pPr>
+              <w:pStyle w:val="Compact"/>
+            </w:pPr>
+            <w:r>
+              <w:rPr>
+                <w:rStyle w:val="VerbatimChar"/>
+              </w:rPr>
+              <w:t xml:space="preserve">riesgoAltoRechazo</w:t>
+            </w:r>
+            <w:r>
+              <w:t xml:space="preserve"> </w:t>
+            </w:r>
+            <w:r>
+              <w:t xml:space="preserve">informativo, sin rechazo automático</w:t>
+            </w:r>
+          </w:p>
+        </w:tc>
+        <w:tc>
+          <w:tcPr/>
+          <w:p>
+            <w:pPr>
+              <w:pStyle w:val="Compact"/>
+            </w:pPr>
+            <w:r>
+              <w:t xml:space="preserve">AC-4, AC-6</w:t>
+            </w:r>
+          </w:p>
+        </w:tc>
+        <w:tc>
+          <w:tcPr/>
+          <w:p>
+            <w:pPr>
+              <w:pStyle w:val="Compact"/>
+            </w:pPr>
+            <w:r>
+              <w:t xml:space="preserve">Puntajes 44 y 40; ambos</w:t>
+            </w:r>
+            <w:r>
+              <w:t xml:space="preserve"> </w:t>
+            </w:r>
+            <w:r>
+              <w:rPr>
+                <w:rStyle w:val="VerbatimChar"/>
+              </w:rPr>
+              <w:t xml:space="preserve">DERIVADO_REVISION</w:t>
+            </w:r>
+            <w:r>
+              <w:t xml:space="preserve">/</w:t>
+            </w:r>
+            <w:r>
+              <w:rPr>
+                <w:rStyle w:val="VerbatimChar"/>
+              </w:rPr>
+              <w:t xml:space="preserve">senal_bajo_minimo</w:t>
+            </w:r>
+            <w:r>
+              <w:t xml:space="preserve">,</w:t>
+            </w:r>
+            <w:r>
+              <w:t xml:space="preserve"> </w:t>
+            </w:r>
+            <w:r>
+              <w:rPr>
+                <w:rStyle w:val="VerbatimChar"/>
+              </w:rPr>
+              <w:t xml:space="preserve">riesgoAltoRechazo: true</w:t>
+            </w:r>
+            <w:r>
+              <w:t xml:space="preserve">.</w:t>
+            </w:r>
+          </w:p>
+        </w:tc>
+        <w:tc>
+          <w:tcPr/>
+          <w:p>
+            <w:pPr>
+              <w:pStyle w:val="Compact"/>
+            </w:pPr>
+            <w:r>
+              <w:t xml:space="preserve">Sí</w:t>
+            </w:r>
+          </w:p>
+        </w:tc>
+      </w:tr>
+      <w:tr>
+        <w:tc>
+          <w:tcPr/>
+          <w:p>
+            <w:pPr>
+              <w:pStyle w:val="Compact"/>
+            </w:pPr>
+            <w:r>
+              <w:t xml:space="preserve">10</w:t>
+            </w:r>
+          </w:p>
+        </w:tc>
+        <w:tc>
+          <w:tcPr/>
+          <w:p>
+            <w:pPr>
+              <w:pStyle w:val="Compact"/>
+            </w:pPr>
+            <w:r>
+              <w:t xml:space="preserve">CASO-MED-005 (F4)</w:t>
+            </w:r>
+          </w:p>
+        </w:tc>
+        <w:tc>
+          <w:tcPr/>
+          <w:p>
+            <w:pPr>
+              <w:pStyle w:val="Compact"/>
+            </w:pPr>
+            <w:r>
+              <w:t xml:space="preserve">Evaluar el caso</w:t>
+            </w:r>
+          </w:p>
+        </w:tc>
+        <w:tc>
+          <w:tcPr/>
+          <w:p>
+            <w:pPr>
+              <w:pStyle w:val="Compact"/>
+            </w:pPr>
+            <w:r>
+              <w:rPr>
+                <w:rStyle w:val="VerbatimChar"/>
+              </w:rPr>
+              <w:t xml:space="preserve">DERIVADO_REVISION</w:t>
+            </w:r>
+            <w:r>
+              <w:t xml:space="preserve"> </w:t>
+            </w:r>
+            <w:r>
+              <w:t xml:space="preserve">por</w:t>
+            </w:r>
+            <w:r>
+              <w:t xml:space="preserve"> </w:t>
+            </w:r>
+            <w:r>
+              <w:rPr>
+                <w:rStyle w:val="VerbatimChar"/>
+              </w:rPr>
+              <w:t xml:space="preserve">puntaje_bajo_umbral</w:t>
+            </w:r>
+          </w:p>
+        </w:tc>
+        <w:tc>
+          <w:tcPr/>
+          <w:p>
+            <w:pPr>
+              <w:pStyle w:val="Compact"/>
+            </w:pPr>
+            <w:r>
+              <w:t xml:space="preserve">AC-5</w:t>
+            </w:r>
+          </w:p>
+        </w:tc>
+        <w:tc>
+          <w:tcPr/>
+          <w:p>
+            <w:pPr>
+              <w:pStyle w:val="Compact"/>
+            </w:pPr>
+            <w:r>
+              <w:t xml:space="preserve">Puntaje 75, sin señales bajo mínimo.</w:t>
+            </w:r>
+          </w:p>
+        </w:tc>
+        <w:tc>
+          <w:tcPr/>
+          <w:p>
+            <w:pPr>
+              <w:pStyle w:val="Compact"/>
+            </w:pPr>
+            <w:r>
+              <w:t xml:space="preserve">Sí</w:t>
+            </w:r>
+          </w:p>
+        </w:tc>
+      </w:tr>
+      <w:tr>
+        <w:tc>
+          <w:tcPr/>
+          <w:p>
+            <w:pPr>
+              <w:pStyle w:val="Compact"/>
+            </w:pPr>
+            <w:r>
+              <w:t xml:space="preserve">11</w:t>
+            </w:r>
+          </w:p>
+        </w:tc>
+        <w:tc>
+          <w:tcPr/>
+          <w:p>
+            <w:pPr>
+              <w:pStyle w:val="Compact"/>
+            </w:pPr>
+            <w:r>
+              <w:t xml:space="preserve">Reevaluación determinista (F4)</w:t>
+            </w:r>
+          </w:p>
+        </w:tc>
+        <w:tc>
+          <w:tcPr/>
+          <w:p>
+            <w:pPr>
+              <w:pStyle w:val="Compact"/>
+            </w:pPr>
+            <w:r>
+              <w:t xml:space="preserve">Reevaluar un registro histórico</w:t>
+            </w:r>
+          </w:p>
+        </w:tc>
+        <w:tc>
+          <w:tcPr/>
+          <w:p>
+            <w:pPr>
+              <w:pStyle w:val="Compact"/>
+            </w:pPr>
+            <w:r>
+              <w:t xml:space="preserve">Reproduce el dictamen original al 100%</w:t>
+            </w:r>
+          </w:p>
+        </w:tc>
+        <w:tc>
+          <w:tcPr/>
+          <w:p>
+            <w:pPr>
+              <w:pStyle w:val="Compact"/>
+            </w:pPr>
+            <w:r>
+              <w:t xml:space="preserve">SC-004</w:t>
+            </w:r>
+          </w:p>
+        </w:tc>
+        <w:tc>
+          <w:tcPr/>
+          <w:p>
+            <w:pPr>
+              <w:pStyle w:val="Compact"/>
+            </w:pPr>
+            <w:r>
+              <w:t xml:space="preserve">11 reevaluaciones registradas, todas exitosas.</w:t>
+            </w:r>
+          </w:p>
+        </w:tc>
+        <w:tc>
+          <w:tcPr/>
+          <w:p>
+            <w:pPr>
+              <w:pStyle w:val="Compact"/>
+            </w:pPr>
+            <w:r>
+              <w:t xml:space="preserve">Sí</w:t>
+            </w:r>
+          </w:p>
+        </w:tc>
+      </w:tr>
+      <w:tr>
+        <w:tc>
+          <w:tcPr/>
+          <w:p>
+            <w:pPr>
+              <w:pStyle w:val="Compact"/>
+            </w:pPr>
+            <w:r>
+              <w:t xml:space="preserve">12</w:t>
+            </w:r>
+          </w:p>
+        </w:tc>
+        <w:tc>
+          <w:tcPr/>
+          <w:p>
+            <w:pPr>
+              <w:pStyle w:val="Compact"/>
+            </w:pPr>
+            <w:r>
+              <w:t xml:space="preserve">Regla transversal</w:t>
+            </w:r>
+          </w:p>
+        </w:tc>
+        <w:tc>
+          <w:tcPr/>
+          <w:p>
+            <w:pPr>
+              <w:pStyle w:val="Compact"/>
+            </w:pPr>
+            <w:r>
+              <w:t xml:space="preserve">Revisar todos los resultados</w:t>
+            </w:r>
+          </w:p>
+        </w:tc>
+        <w:tc>
+          <w:tcPr/>
+          <w:p>
+            <w:pPr>
+              <w:pStyle w:val="Compact"/>
+            </w:pPr>
+            <w:r>
+              <w:t xml:space="preserve">Ningún caso termina en rechazo automático</w:t>
+            </w:r>
+          </w:p>
+        </w:tc>
+        <w:tc>
+          <w:tcPr/>
+          <w:p>
+            <w:pPr>
+              <w:pStyle w:val="Compact"/>
+            </w:pPr>
+            <w:r>
+              <w:t xml:space="preserve">—</w:t>
+            </w:r>
+          </w:p>
+        </w:tc>
+        <w:tc>
+          <w:tcPr/>
+          <w:p>
+            <w:pPr>
+              <w:pStyle w:val="Compact"/>
+            </w:pPr>
+            <w:r>
+              <w:t xml:space="preserve">1</w:t>
+            </w:r>
+            <w:r>
+              <w:t xml:space="preserve"> </w:t>
+            </w:r>
+            <w:r>
+              <w:rPr>
+                <w:rStyle w:val="VerbatimChar"/>
+              </w:rPr>
+              <w:t xml:space="preserve">APROBADO_AUTOMATICO</w:t>
+            </w:r>
+            <w:r>
+              <w:t xml:space="preserve"> </w:t>
+            </w:r>
+            <w:r>
+              <w:t xml:space="preserve">+ 6</w:t>
+            </w:r>
+            <w:r>
+              <w:t xml:space="preserve"> </w:t>
+            </w:r>
+            <w:r>
+              <w:rPr>
+                <w:rStyle w:val="VerbatimChar"/>
+              </w:rPr>
+              <w:t xml:space="preserve">DERIVADO_REVISION</w:t>
+            </w:r>
+            <w:r>
+              <w:t xml:space="preserve">; cero rechazos.</w:t>
+            </w:r>
+          </w:p>
+        </w:tc>
+        <w:tc>
+          <w:tcPr/>
+          <w:p>
+            <w:pPr>
+              <w:pStyle w:val="Compact"/>
+            </w:pPr>
+            <w:r>
+              <w:t xml:space="preserve">Sí</w:t>
+            </w:r>
+          </w:p>
+        </w:tc>
+      </w:tr>
+    </w:tbl>
+    <w:p>
+      <w:pPr>
+        <w:pStyle w:val="BlockText"/>
+      </w:pPr>
+      <w:r>
+        <w:t xml:space="preserve">[EDITAR: adjuntar</w:t>
+      </w:r>
+      <w:r>
+        <w:t xml:space="preserve"> </w:t>
+      </w:r>
+      <w:r>
+        <w:rPr>
+          <w:rStyle w:val="VerbatimChar"/>
+        </w:rPr>
+        <w:t xml:space="preserve">docs/entregable2/evidencia/sesion-aceptacion-historial-evaluaciones.json</w:t>
+      </w:r>
+      <w:r>
+        <w:t xml:space="preserve"> </w:t>
+      </w:r>
+      <w:r>
+        <w:t xml:space="preserve">y</w:t>
+      </w:r>
+      <w:r>
+        <w:t xml:space="preserve"> </w:t>
+      </w:r>
+      <w:r>
+        <w:rPr>
+          <w:rStyle w:val="VerbatimChar"/>
+        </w:rPr>
+        <w:t xml:space="preserve">...-historial-umbrales.json</w:t>
+      </w:r>
+      <w:r>
+        <w:t xml:space="preserve"> </w:t>
+      </w:r>
+      <w:r>
+        <w:t xml:space="preserve">citados como anexo de esta acta — no existen todavía en el repositorio].</w:t>
+      </w:r>
+    </w:p>
+    <w:p>
+      <w:pPr>
+        <w:pStyle w:val="Heading3"/>
+      </w:pPr>
+      <w:bookmarkStart w:id="26" w:name="_ccc21e56db6afc66b386cb2a8c49c05a2a7e958"/>
+      <w:r>
+        <w:t xml:space="preserve">A.3 Hallazgos de usabilidad comunicados al cliente y reacción</w:t>
+      </w:r>
+      <w:bookmarkEnd w:id="26"/>
+    </w:p>
+    <w:p>
+      <w:pPr>
+        <w:pStyle w:val="FirstParagraph"/>
+      </w:pPr>
+      <w:r>
+        <w:t xml:space="preserve">Se informó el resultado de la prueba con personas externas (</w:t>
+      </w:r>
+      <w:r>
+        <w:rPr>
+          <w:rStyle w:val="VerbatimChar"/>
+        </w:rPr>
+        <w:t xml:space="preserve">docs/entregable2/usabilidad.md</w:t>
+      </w:r>
+      <w:r>
+        <w:t xml:space="preserve">):</w:t>
+      </w:r>
+      <w:r>
+        <w:t xml:space="preserve"> </w:t>
+      </w:r>
+      <w:r>
+        <w:rPr>
+          <w:rStyle w:val="VerbatimChar"/>
+        </w:rPr>
+        <w:t xml:space="preserve">SC-005</w:t>
+      </w:r>
+      <w:r>
+        <w:t xml:space="preserve"> </w:t>
+      </w:r>
+      <w:r>
+        <w:t xml:space="preserve">no se cumple en la dimensión manual. Reacción textual del cliente:</w:t>
+      </w:r>
+    </w:p>
+    <w:p>
+      <w:pPr>
+        <w:pStyle w:val="BlockText"/>
+      </w:pPr>
+      <w:r>
+        <w:t xml:space="preserve">mi reaccion es que nececitan hacerlo mas responsivo y de mas intuitivo para la gente que no sea experta</w:t>
+      </w:r>
+    </w:p>
+    <w:p>
+      <w:pPr>
+        <w:pStyle w:val="Heading3"/>
+      </w:pPr>
+      <w:bookmarkStart w:id="27" w:name="_8a578a2231633459a997fe2f4f1a8adf556a7ac"/>
+      <w:r>
+        <w:t xml:space="preserve">A.4 Resultado y observaciones del cliente</w:t>
+      </w:r>
+      <w:bookmarkEnd w:id="27"/>
+    </w:p>
+    <w:p>
+      <w:pPr>
+        <w:pStyle w:val="FirstParagraph"/>
+      </w:pPr>
+      <w:r>
+        <w:rPr>
+          <w:b/>
+          <w:bCs/>
+        </w:rPr>
+        <w:t xml:space="preserve">Resultado: Aceptado.</w:t>
+      </w:r>
+    </w:p>
+    <w:p>
+      <w:pPr>
+        <w:pStyle w:val="BodyText"/>
+      </w:pPr>
+      <w:r>
+        <w:t xml:space="preserve">Observación textual del cliente:</w:t>
+      </w:r>
+    </w:p>
+    <w:p>
+      <w:pPr>
+        <w:pStyle w:val="BlockText"/>
+      </w:pPr>
+      <w:r>
+        <w:t xml:space="preserve">el tamaño de la puntuacion que se genera en la evaluacion es muy pequeña y es opacada por los demas textos. Hay mucha informacion en pantalla que no es relevante para lo que se va a realizar o aparece varias veces presentada, lo cual genera confusiones y hay algunas opciones que es necesario escrolear para encontrar lo cual puede confundir a los usuarios.</w:t>
+      </w:r>
+    </w:p>
+    <w:p>
+      <w:pPr>
+        <w:pStyle w:val="FirstParagraph"/>
+      </w:pPr>
+      <w:r>
+        <w:rPr>
+          <w:b/>
+          <w:bCs/>
+        </w:rPr>
+        <w:t xml:space="preserve">Acciones derivadas (propuestas en la sesión del equipo del 19-oct, 10:00):</w:t>
+      </w:r>
+    </w:p>
+    <w:tbl>
+      <w:tblPr>
+        <w:tblStyle w:val="Table"/>
+        <w:tblW w:type="pct" w:w="5000"/>
+        <w:tblLayout w:type="fixed"/>
+        <w:tblLook w:firstRow="1" w:lastRow="0" w:firstColumn="0" w:lastColumn="0" w:noHBand="0" w:noVBand="0" w:val="0020"/>
+      </w:tblPr>
+      <w:tblGrid>
+        <w:gridCol w:w="1980"/>
+        <w:gridCol w:w="1980"/>
+        <w:gridCol w:w="1980"/>
+        <w:gridCol w:w="1980"/>
+      </w:tblGrid>
+      <w:tr>
+        <w:trPr>
+          <w:tblHeader w:val="on"/>
+        </w:trPr>
+        <w:tc>
+          <w:tcPr/>
+          <w:p>
+            <w:pPr>
+              <w:pStyle w:val="Compact"/>
+            </w:pPr>
+            <w:r>
+              <w:t xml:space="preserve">#</w:t>
+            </w:r>
+          </w:p>
+        </w:tc>
+        <w:tc>
+          <w:tcPr/>
+          <w:p>
+            <w:pPr>
+              <w:pStyle w:val="Compact"/>
+            </w:pPr>
+            <w:r>
+              <w:t xml:space="preserve">Acción</w:t>
+            </w:r>
+          </w:p>
+        </w:tc>
+        <w:tc>
+          <w:tcPr/>
+          <w:p>
+            <w:pPr>
+              <w:pStyle w:val="Compact"/>
+            </w:pPr>
+            <w:r>
+              <w:t xml:space="preserve">Responsable</w:t>
+            </w:r>
+          </w:p>
+        </w:tc>
+        <w:tc>
+          <w:tcPr/>
+          <w:p>
+            <w:pPr>
+              <w:pStyle w:val="Compact"/>
+            </w:pPr>
+            <w:r>
+              <w:t xml:space="preserve">Plazo</w:t>
+            </w:r>
+          </w:p>
+        </w:tc>
+      </w:tr>
+      <w:tr>
+        <w:tc>
+          <w:tcPr/>
+          <w:p>
+            <w:pPr>
+              <w:pStyle w:val="Compact"/>
+            </w:pPr>
+            <w:r>
+              <w:t xml:space="preserve">1</w:t>
+            </w:r>
+          </w:p>
+        </w:tc>
+        <w:tc>
+          <w:tcPr/>
+          <w:p>
+            <w:pPr>
+              <w:pStyle w:val="Compact"/>
+            </w:pPr>
+            <w:r>
+              <w:t xml:space="preserve">Aumentar el tamaño de la puntuación y reducir texto repetido</w:t>
+            </w:r>
+          </w:p>
+        </w:tc>
+        <w:tc>
+          <w:tcPr/>
+          <w:p>
+            <w:pPr>
+              <w:pStyle w:val="Compact"/>
+            </w:pPr>
+            <w:r>
+              <w:t xml:space="preserve">Jorge Alvarez (por confirmar)</w:t>
+            </w:r>
+          </w:p>
+        </w:tc>
+        <w:tc>
+          <w:tcPr/>
+          <w:p>
+            <w:pPr>
+              <w:pStyle w:val="Compact"/>
+            </w:pPr>
+            <w:r>
+              <w:t xml:space="preserve">Decisión del equipo, 19-oct 10:00</w:t>
+            </w:r>
+          </w:p>
+        </w:tc>
+      </w:tr>
+      <w:tr>
+        <w:tc>
+          <w:tcPr/>
+          <w:p>
+            <w:pPr>
+              <w:pStyle w:val="Compact"/>
+            </w:pPr>
+            <w:r>
+              <w:t xml:space="preserve">2</w:t>
+            </w:r>
+          </w:p>
+        </w:tc>
+        <w:tc>
+          <w:tcPr/>
+          <w:p>
+            <w:pPr>
+              <w:pStyle w:val="Compact"/>
+            </w:pPr>
+            <w:r>
+              <w:t xml:space="preserve">Evitar que opciones clave requieran scroll</w:t>
+            </w:r>
+          </w:p>
+        </w:tc>
+        <w:tc>
+          <w:tcPr/>
+          <w:p>
+            <w:pPr>
+              <w:pStyle w:val="Compact"/>
+            </w:pPr>
+            <w:r>
+              <w:t xml:space="preserve">Jorge Alvarez (por confirmar)</w:t>
+            </w:r>
+          </w:p>
+        </w:tc>
+        <w:tc>
+          <w:tcPr/>
+          <w:p>
+            <w:pPr>
+              <w:pStyle w:val="Compact"/>
+            </w:pPr>
+            <w:r>
+              <w:t xml:space="preserve">Idem</w:t>
+            </w:r>
+          </w:p>
+        </w:tc>
+      </w:tr>
+      <w:tr>
+        <w:tc>
+          <w:tcPr/>
+          <w:p>
+            <w:pPr>
+              <w:pStyle w:val="Compact"/>
+            </w:pPr>
+            <w:r>
+              <w:t xml:space="preserve">3</w:t>
+            </w:r>
+          </w:p>
+        </w:tc>
+        <w:tc>
+          <w:tcPr/>
+          <w:p>
+            <w:pPr>
+              <w:pStyle w:val="Compact"/>
+            </w:pPr>
+            <w:r>
+              <w:t xml:space="preserve">Hacer más visibles los menús y el selector de rol; instructivo inicial breve</w:t>
+            </w:r>
+          </w:p>
+        </w:tc>
+        <w:tc>
+          <w:tcPr/>
+          <w:p>
+            <w:pPr>
+              <w:pStyle w:val="Compact"/>
+            </w:pPr>
+            <w:r>
+              <w:t xml:space="preserve">Jorge Alvarez (por confirmar)</w:t>
+            </w:r>
+          </w:p>
+        </w:tc>
+        <w:tc>
+          <w:tcPr/>
+          <w:p>
+            <w:pPr>
+              <w:pStyle w:val="Compact"/>
+            </w:pPr>
+            <w:r>
+              <w:t xml:space="preserve">Idem</w:t>
+            </w:r>
+          </w:p>
+        </w:tc>
+      </w:tr>
+    </w:tbl>
+    <w:p>
+      <w:pPr>
+        <w:pStyle w:val="FirstParagraph"/>
+      </w:pPr>
+      <w:r>
+        <w:t xml:space="preserve">Confirmación final de la categoría de aceptación a cargo de Rodrigo Guerrero, en comentario del PR que incorpora esta acta.</w:t>
       </w:r>
     </w:p>
     <w:sectPr>

</xml_diff>